<commit_message>
Implementazione funzione di salvataggio di prenotazione
Aggiunta in FirebaseService e MapView delle funzioni per salvare la prenotazione del database nel modo prenotazioni/stringa data ora/ infoPrenotazioni. Da sistemare logica di controllo dati in fasi di prenotazione.
Aggiunta timbratura dei giorni precedenti.
</commit_message>
<xml_diff>
--- a/documentazione/meeting.docx
+++ b/documentazione/meeting.docx
@@ -188,7 +188,15 @@
         </w:numPr>
       </w:pPr>
       <w:r>
-        <w:t>prenotazione colonnina scegliendo data, ora luogo, generazione qr-code e codice</w:t>
+        <w:t xml:space="preserve">prenotazione colonnina scegliendo data, ora luogo, generazione </w:t>
+      </w:r>
+      <w:proofErr w:type="spellStart"/>
+      <w:r>
+        <w:t>qr-code</w:t>
+      </w:r>
+      <w:proofErr w:type="spellEnd"/>
+      <w:r>
+        <w:t xml:space="preserve"> e codice</w:t>
       </w:r>
     </w:p>
     <w:p>
@@ -354,26 +362,62 @@
       <w:r>
         <w:t xml:space="preserve">prioritizzazione requisiti : </w:t>
       </w:r>
-      <w:r>
-        <w:t>MoSCOW (manca collegamento ai requisiti funzionali e non funzionali)</w:t>
+      <w:proofErr w:type="spellStart"/>
+      <w:r>
+        <w:t>MoSCOW</w:t>
+      </w:r>
+      <w:proofErr w:type="spellEnd"/>
+      <w:r>
+        <w:t xml:space="preserve"> (manca collegamento ai requisiti funzionali e non funzionali)</w:t>
       </w:r>
     </w:p>
     <w:p>
       <w:r>
         <w:br/>
-        <w:t>must have:</w:t>
-      </w:r>
-    </w:p>
-    <w:p>
-      <w:r>
-        <w:t>registrazione e accesso personale con credenziali (username / mail, password) all’applicazione, pagina home con mappa centrale, barra laterale (profilo, lista prenotazioni attive e concluse, lista colonnine disponibili con filtri e scheda colonnine singole, ordinamento, logout), prenotazione colonnina scegliendo data, ora luogo, generazione qr-code e codice, posizioni sulla mappa colonnine, usabilità base</w:t>
+        <w:t xml:space="preserve">must </w:t>
+      </w:r>
+      <w:proofErr w:type="spellStart"/>
+      <w:r>
+        <w:t>have</w:t>
+      </w:r>
+      <w:proofErr w:type="spellEnd"/>
+      <w:r>
+        <w:t>:</w:t>
+      </w:r>
+    </w:p>
+    <w:p>
+      <w:r>
+        <w:t xml:space="preserve">registrazione e accesso personale con credenziali (username / mail, password) all’applicazione, pagina home con mappa centrale, barra laterale (profilo, lista prenotazioni attive e concluse, lista colonnine disponibili con filtri e scheda colonnine singole, ordinamento, logout), prenotazione colonnina scegliendo data, ora luogo, generazione </w:t>
+      </w:r>
+      <w:proofErr w:type="spellStart"/>
+      <w:r>
+        <w:t>qr-code</w:t>
+      </w:r>
+      <w:proofErr w:type="spellEnd"/>
+      <w:r>
+        <w:t xml:space="preserve"> e codice, posizioni sulla mappa colonnine, usabilità base</w:t>
       </w:r>
       <w:r>
         <w:br/>
       </w:r>
       <w:r>
         <w:br/>
-        <w:t>should have: </w:t>
+      </w:r>
+      <w:proofErr w:type="spellStart"/>
+      <w:r>
+        <w:t>should</w:t>
+      </w:r>
+      <w:proofErr w:type="spellEnd"/>
+      <w:r>
+        <w:t xml:space="preserve"> </w:t>
+      </w:r>
+      <w:proofErr w:type="spellStart"/>
+      <w:r>
+        <w:t>have</w:t>
+      </w:r>
+      <w:proofErr w:type="spellEnd"/>
+      <w:r>
+        <w:t>: </w:t>
       </w:r>
     </w:p>
     <w:p>
@@ -385,7 +429,22 @@
       </w:r>
       <w:r>
         <w:br/>
-        <w:t>could have: </w:t>
+      </w:r>
+      <w:proofErr w:type="spellStart"/>
+      <w:r>
+        <w:t>could</w:t>
+      </w:r>
+      <w:proofErr w:type="spellEnd"/>
+      <w:r>
+        <w:t xml:space="preserve"> </w:t>
+      </w:r>
+      <w:proofErr w:type="spellStart"/>
+      <w:r>
+        <w:t>have</w:t>
+      </w:r>
+      <w:proofErr w:type="spellEnd"/>
+      <w:r>
+        <w:t>: </w:t>
       </w:r>
     </w:p>
     <w:p>
@@ -407,7 +466,22 @@
       </w:r>
       <w:r>
         <w:br/>
-        <w:t>won’t have:</w:t>
+      </w:r>
+      <w:proofErr w:type="spellStart"/>
+      <w:r>
+        <w:t>won’t</w:t>
+      </w:r>
+      <w:proofErr w:type="spellEnd"/>
+      <w:r>
+        <w:t xml:space="preserve"> </w:t>
+      </w:r>
+      <w:proofErr w:type="spellStart"/>
+      <w:r>
+        <w:t>have</w:t>
+      </w:r>
+      <w:proofErr w:type="spellEnd"/>
+      <w:r>
+        <w:t>:</w:t>
       </w:r>
     </w:p>
     <w:p>
@@ -429,24 +503,59 @@
         </w:numPr>
       </w:pPr>
       <w:r>
-        <w:t>front end -&gt; Vaadin</w:t>
-      </w:r>
+        <w:t xml:space="preserve">front end -&gt; </w:t>
+      </w:r>
+      <w:proofErr w:type="spellStart"/>
+      <w:r>
+        <w:t>Vaadin</w:t>
+      </w:r>
+      <w:proofErr w:type="spellEnd"/>
       <w:r>
         <w:br/>
-        <w:t>back end -&gt; Java, Springboot</w:t>
-      </w:r>
+        <w:t xml:space="preserve">back end -&gt; Java, </w:t>
+      </w:r>
+      <w:proofErr w:type="spellStart"/>
+      <w:r>
+        <w:t>Springboot</w:t>
+      </w:r>
+      <w:proofErr w:type="spellEnd"/>
       <w:r>
         <w:br/>
-        <w:t>database -&gt; Firebase/MySQL</w:t>
+        <w:t xml:space="preserve">database -&gt; </w:t>
+      </w:r>
+      <w:proofErr w:type="spellStart"/>
+      <w:r>
+        <w:t>Firebase</w:t>
+      </w:r>
+      <w:proofErr w:type="spellEnd"/>
+      <w:r>
+        <w:t>/MySQL</w:t>
       </w:r>
       <w:r>
         <w:br/>
-        <w:t>mappa -&gt; Leaflet</w:t>
-      </w:r>
+        <w:t xml:space="preserve">mappa -&gt; </w:t>
+      </w:r>
+      <w:proofErr w:type="spellStart"/>
+      <w:r>
+        <w:t>Leaflet</w:t>
+      </w:r>
+      <w:proofErr w:type="spellEnd"/>
       <w:r>
         <w:br/>
-        <w:t>qr-code -&gt; ZXing</w:t>
-      </w:r>
+      </w:r>
+      <w:proofErr w:type="spellStart"/>
+      <w:r>
+        <w:t>qr-code</w:t>
+      </w:r>
+      <w:proofErr w:type="spellEnd"/>
+      <w:r>
+        <w:t xml:space="preserve"> -&gt; </w:t>
+      </w:r>
+      <w:proofErr w:type="spellStart"/>
+      <w:r>
+        <w:t>ZXing</w:t>
+      </w:r>
+      <w:proofErr w:type="spellEnd"/>
     </w:p>
     <w:p>
       <w:pPr>
@@ -509,7 +618,15 @@
       </w:r>
       <w:r>
         <w:br/>
-        <w:t>utente, colonnina, automobile, indirizzo, mappa, prenotazione, valutazione, gestoreprenotazione, admin</w:t>
+        <w:t xml:space="preserve">utente, colonnina, automobile, indirizzo, mappa, prenotazione, valutazione, </w:t>
+      </w:r>
+      <w:proofErr w:type="spellStart"/>
+      <w:r>
+        <w:t>gestoreprenotazione</w:t>
+      </w:r>
+      <w:proofErr w:type="spellEnd"/>
+      <w:r>
+        <w:t>, admin</w:t>
       </w:r>
     </w:p>
     <w:p/>
@@ -541,7 +658,15 @@
     </w:p>
     <w:p>
       <w:r>
-        <w:t xml:space="preserve">Stesura dei diagrammi UML dei casi d’uso e della state machine con Papyrus. </w:t>
+        <w:t xml:space="preserve">Stesura dei diagrammi UML dei casi d’uso e della state machine con </w:t>
+      </w:r>
+      <w:proofErr w:type="spellStart"/>
+      <w:r>
+        <w:t>Papyrus</w:t>
+      </w:r>
+      <w:proofErr w:type="spellEnd"/>
+      <w:r>
+        <w:t xml:space="preserve">. </w:t>
       </w:r>
     </w:p>
     <w:p/>
@@ -601,9 +726,96 @@
     </w:p>
     <w:p>
       <w:r>
-        <w:t>Inizializzazione progetto cona aggiunta di dipendenze per utilizzo di Vaadin e SpringBoot e creazione classe Application per il funzionamento del programma.</w:t>
-      </w:r>
-    </w:p>
+        <w:t xml:space="preserve">Inizializzazione progetto cona aggiunta di dipendenze per utilizzo di </w:t>
+      </w:r>
+      <w:proofErr w:type="spellStart"/>
+      <w:r>
+        <w:t>Vaadin</w:t>
+      </w:r>
+      <w:proofErr w:type="spellEnd"/>
+      <w:r>
+        <w:t xml:space="preserve"> e </w:t>
+      </w:r>
+      <w:proofErr w:type="spellStart"/>
+      <w:r>
+        <w:t>SpringBoot</w:t>
+      </w:r>
+      <w:proofErr w:type="spellEnd"/>
+      <w:r>
+        <w:t xml:space="preserve"> e creazione classe Application per il funzionamento del programma.</w:t>
+      </w:r>
+    </w:p>
+    <w:p/>
+    <w:p>
+      <w:pPr>
+        <w:rPr>
+          <w:b/>
+          <w:bCs/>
+          <w:u w:val="single"/>
+        </w:rPr>
+      </w:pPr>
+      <w:r>
+        <w:rPr>
+          <w:b/>
+          <w:bCs/>
+          <w:u w:val="single"/>
+        </w:rPr>
+        <w:t xml:space="preserve">Meeting </w:t>
+      </w:r>
+      <w:r>
+        <w:rPr>
+          <w:b/>
+          <w:bCs/>
+          <w:u w:val="single"/>
+        </w:rPr>
+        <w:t>10</w:t>
+      </w:r>
+      <w:r>
+        <w:rPr>
+          <w:b/>
+          <w:bCs/>
+          <w:u w:val="single"/>
+        </w:rPr>
+        <w:t>/1</w:t>
+      </w:r>
+      <w:r>
+        <w:rPr>
+          <w:b/>
+          <w:bCs/>
+          <w:u w:val="single"/>
+        </w:rPr>
+        <w:t>1</w:t>
+      </w:r>
+      <w:r>
+        <w:rPr>
+          <w:b/>
+          <w:bCs/>
+          <w:u w:val="single"/>
+        </w:rPr>
+        <w:t>/25</w:t>
+      </w:r>
+    </w:p>
+    <w:p>
+      <w:r>
+        <w:t xml:space="preserve">Analisi delle modifiche effettuate nella settimana precedente, discussione riguardo problemi e obiettivi raggiunti. </w:t>
+      </w:r>
+    </w:p>
+    <w:p>
+      <w:r>
+        <w:t>Nessun problema importante è stato rilevato, il software funziona in maniera corretta ma parziale.</w:t>
+      </w:r>
+    </w:p>
+    <w:p>
+      <w:r>
+        <w:t>Decisione di aggiungere un documento a parte per descrivere in maniera più esplicita la specifica dei requisiti con nome, descrizione e data in cui è stato raggiunto.</w:t>
+      </w:r>
+    </w:p>
+    <w:p>
+      <w:r>
+        <w:t>Nella prossima settimana il team punta ad aggiungere le funzionalità essenziali rimanenti, quali la gestione delle prenotazioni e tutte le pagine che al momento sono vuote.</w:t>
+      </w:r>
+    </w:p>
+    <w:p/>
     <w:p/>
     <w:p/>
     <w:p>
@@ -2096,7 +2308,7 @@
   <w:style w:type="paragraph" w:default="1" w:styleId="Normale">
     <w:name w:val="Normal"/>
     <w:qFormat/>
-    <w:rsid w:val="00F93092"/>
+    <w:rsid w:val="0081618B"/>
   </w:style>
   <w:style w:type="paragraph" w:styleId="Titolo1">
     <w:name w:val="heading 1"/>
@@ -2300,6 +2512,7 @@
   <w:style w:type="character" w:default="1" w:styleId="Carpredefinitoparagrafo">
     <w:name w:val="Default Paragraph Font"/>
     <w:uiPriority w:val="1"/>
+    <w:semiHidden/>
     <w:unhideWhenUsed/>
   </w:style>
   <w:style w:type="table" w:default="1" w:styleId="Tabellanormale">

</xml_diff>

<commit_message>
Aggiunta visualizzazione auto nella pagina profilo + esempio con card
Ho aggiunto funzioni in firebaseAuto e profileView per visualizzare le auto dell'utente con annesso stato di ricarica. Sistemato errori project plan e rifinito il file dei meeting con aggiunta di quello di questa settimana.
</commit_message>
<xml_diff>
--- a/documentazione/meeting.docx
+++ b/documentazione/meeting.docx
@@ -188,7 +188,15 @@
         </w:numPr>
       </w:pPr>
       <w:r>
-        <w:t>prenotazione colonnina scegliendo data, ora luogo, generazione qr-code e codice</w:t>
+        <w:t xml:space="preserve">prenotazione colonnina scegliendo data, ora luogo, generazione </w:t>
+      </w:r>
+      <w:proofErr w:type="spellStart"/>
+      <w:r>
+        <w:t>qr-code</w:t>
+      </w:r>
+      <w:proofErr w:type="spellEnd"/>
+      <w:r>
+        <w:t xml:space="preserve"> e codice</w:t>
       </w:r>
     </w:p>
     <w:p>
@@ -354,26 +362,62 @@
       <w:r>
         <w:t xml:space="preserve">prioritizzazione requisiti : </w:t>
       </w:r>
-      <w:r>
-        <w:t>MoSCOW (manca collegamento ai requisiti funzionali e non funzionali)</w:t>
+      <w:proofErr w:type="spellStart"/>
+      <w:r>
+        <w:t>MoSCOW</w:t>
+      </w:r>
+      <w:proofErr w:type="spellEnd"/>
+      <w:r>
+        <w:t xml:space="preserve"> (manca collegamento ai requisiti funzionali e non funzionali)</w:t>
       </w:r>
     </w:p>
     <w:p>
       <w:r>
         <w:br/>
-        <w:t>must have:</w:t>
-      </w:r>
-    </w:p>
-    <w:p>
-      <w:r>
-        <w:t>registrazione e accesso personale con credenziali (username / mail, password) all’applicazione, pagina home con mappa centrale, barra laterale (profilo, lista prenotazioni attive e concluse, lista colonnine disponibili con filtri e scheda colonnine singole, ordinamento, logout), prenotazione colonnina scegliendo data, ora luogo, generazione qr-code e codice, posizioni sulla mappa colonnine, usabilità base</w:t>
+        <w:t xml:space="preserve">must </w:t>
+      </w:r>
+      <w:proofErr w:type="spellStart"/>
+      <w:r>
+        <w:t>have</w:t>
+      </w:r>
+      <w:proofErr w:type="spellEnd"/>
+      <w:r>
+        <w:t>:</w:t>
+      </w:r>
+    </w:p>
+    <w:p>
+      <w:r>
+        <w:t xml:space="preserve">registrazione e accesso personale con credenziali (username / mail, password) all’applicazione, pagina home con mappa centrale, barra laterale (profilo, lista prenotazioni attive e concluse, lista colonnine disponibili con filtri e scheda colonnine singole, ordinamento, logout), prenotazione colonnina scegliendo data, ora luogo, generazione </w:t>
+      </w:r>
+      <w:proofErr w:type="spellStart"/>
+      <w:r>
+        <w:t>qr-code</w:t>
+      </w:r>
+      <w:proofErr w:type="spellEnd"/>
+      <w:r>
+        <w:t xml:space="preserve"> e codice, posizioni sulla mappa colonnine, usabilità base</w:t>
       </w:r>
       <w:r>
         <w:br/>
       </w:r>
       <w:r>
         <w:br/>
-        <w:t>should have: </w:t>
+      </w:r>
+      <w:proofErr w:type="spellStart"/>
+      <w:r>
+        <w:t>should</w:t>
+      </w:r>
+      <w:proofErr w:type="spellEnd"/>
+      <w:r>
+        <w:t xml:space="preserve"> </w:t>
+      </w:r>
+      <w:proofErr w:type="spellStart"/>
+      <w:r>
+        <w:t>have</w:t>
+      </w:r>
+      <w:proofErr w:type="spellEnd"/>
+      <w:r>
+        <w:t>: </w:t>
       </w:r>
     </w:p>
     <w:p>
@@ -385,7 +429,22 @@
       </w:r>
       <w:r>
         <w:br/>
-        <w:t>could have: </w:t>
+      </w:r>
+      <w:proofErr w:type="spellStart"/>
+      <w:r>
+        <w:t>could</w:t>
+      </w:r>
+      <w:proofErr w:type="spellEnd"/>
+      <w:r>
+        <w:t xml:space="preserve"> </w:t>
+      </w:r>
+      <w:proofErr w:type="spellStart"/>
+      <w:r>
+        <w:t>have</w:t>
+      </w:r>
+      <w:proofErr w:type="spellEnd"/>
+      <w:r>
+        <w:t>: </w:t>
       </w:r>
     </w:p>
     <w:p>
@@ -407,7 +466,22 @@
       </w:r>
       <w:r>
         <w:br/>
-        <w:t>won’t have:</w:t>
+      </w:r>
+      <w:proofErr w:type="spellStart"/>
+      <w:r>
+        <w:t>won’t</w:t>
+      </w:r>
+      <w:proofErr w:type="spellEnd"/>
+      <w:r>
+        <w:t xml:space="preserve"> </w:t>
+      </w:r>
+      <w:proofErr w:type="spellStart"/>
+      <w:r>
+        <w:t>have</w:t>
+      </w:r>
+      <w:proofErr w:type="spellEnd"/>
+      <w:r>
+        <w:t>:</w:t>
       </w:r>
     </w:p>
     <w:p>
@@ -429,24 +503,51 @@
         </w:numPr>
       </w:pPr>
       <w:r>
-        <w:t>front end -&gt; Vaadin</w:t>
-      </w:r>
+        <w:t xml:space="preserve">front end -&gt; </w:t>
+      </w:r>
+      <w:proofErr w:type="spellStart"/>
+      <w:r>
+        <w:t>Vaadin</w:t>
+      </w:r>
+      <w:proofErr w:type="spellEnd"/>
       <w:r>
         <w:br/>
-        <w:t>back end -&gt; Java, Springboot</w:t>
-      </w:r>
+        <w:t xml:space="preserve">back end -&gt; Java, </w:t>
+      </w:r>
+      <w:proofErr w:type="spellStart"/>
+      <w:r>
+        <w:t>Springboot</w:t>
+      </w:r>
+      <w:proofErr w:type="spellEnd"/>
       <w:r>
         <w:br/>
         <w:t>database -&gt; Firebase/MySQL</w:t>
       </w:r>
       <w:r>
         <w:br/>
-        <w:t>mappa -&gt; Leaflet</w:t>
-      </w:r>
+        <w:t xml:space="preserve">mappa -&gt; </w:t>
+      </w:r>
+      <w:proofErr w:type="spellStart"/>
+      <w:r>
+        <w:t>Leaflet</w:t>
+      </w:r>
+      <w:proofErr w:type="spellEnd"/>
       <w:r>
         <w:br/>
-        <w:t>qr-code -&gt; ZXing</w:t>
-      </w:r>
+      </w:r>
+      <w:proofErr w:type="spellStart"/>
+      <w:r>
+        <w:t>qr-code</w:t>
+      </w:r>
+      <w:proofErr w:type="spellEnd"/>
+      <w:r>
+        <w:t xml:space="preserve"> -&gt; </w:t>
+      </w:r>
+      <w:proofErr w:type="spellStart"/>
+      <w:r>
+        <w:t>ZXing</w:t>
+      </w:r>
+      <w:proofErr w:type="spellEnd"/>
     </w:p>
     <w:p>
       <w:pPr>
@@ -509,7 +610,15 @@
       </w:r>
       <w:r>
         <w:br/>
-        <w:t>utente, colonnina, automobile, indirizzo, mappa, prenotazione, valutazione, gestoreprenotazione, admin</w:t>
+        <w:t xml:space="preserve">utente, colonnina, automobile, indirizzo, mappa, prenotazione, valutazione, </w:t>
+      </w:r>
+      <w:proofErr w:type="spellStart"/>
+      <w:r>
+        <w:t>gestoreprenotazione</w:t>
+      </w:r>
+      <w:proofErr w:type="spellEnd"/>
+      <w:r>
+        <w:t>, admin</w:t>
       </w:r>
       <w:r>
         <w:t xml:space="preserve"> + inizio di stesura su carta di una bozza di diagramma delle classi.</w:t>
@@ -518,6 +627,7 @@
     <w:p/>
     <w:p>
       <w:pPr>
+        <w:spacing w:after="0"/>
         <w:rPr>
           <w:b/>
           <w:bCs/>
@@ -543,13 +653,34 @@
       </w:r>
     </w:p>
     <w:p>
-      <w:r>
-        <w:t xml:space="preserve">Stesura dei diagrammi UML dei casi d’uso e della state machine con Papyrus. </w:t>
-      </w:r>
-    </w:p>
-    <w:p/>
-    <w:p>
-      <w:pPr>
+      <w:pPr>
+        <w:spacing w:after="0"/>
+      </w:pPr>
+      <w:r>
+        <w:t xml:space="preserve">Stesura dei diagrammi UML dei casi d’uso e della state machine con </w:t>
+      </w:r>
+      <w:proofErr w:type="spellStart"/>
+      <w:r>
+        <w:t>Papyrus</w:t>
+      </w:r>
+      <w:proofErr w:type="spellEnd"/>
+      <w:r>
+        <w:t xml:space="preserve">. </w:t>
+      </w:r>
+    </w:p>
+    <w:p>
+      <w:pPr>
+        <w:spacing w:after="0"/>
+      </w:pPr>
+    </w:p>
+    <w:p>
+      <w:pPr>
+        <w:spacing w:after="0"/>
+      </w:pPr>
+    </w:p>
+    <w:p>
+      <w:pPr>
+        <w:spacing w:after="0"/>
         <w:rPr>
           <w:b/>
           <w:bCs/>
@@ -598,18 +729,50 @@
       </w:r>
     </w:p>
     <w:p>
+      <w:pPr>
+        <w:spacing w:after="0"/>
+      </w:pPr>
       <w:r>
         <w:t>Creazione repository privata su GitHub, aggiunta membri alla repo, aggiunta documenti e informazione dei meeting precedenti.</w:t>
       </w:r>
     </w:p>
     <w:p>
-      <w:r>
-        <w:t>Inizializzazione progetto cona aggiunta di dipendenze per utilizzo di Vaadin e SpringBoot e creazione classe Application per il funzionamento del programma.</w:t>
-      </w:r>
-    </w:p>
-    <w:p/>
-    <w:p>
-      <w:pPr>
+      <w:pPr>
+        <w:spacing w:after="0"/>
+      </w:pPr>
+      <w:r>
+        <w:t xml:space="preserve">Inizializzazione progetto cona aggiunta di dipendenze per utilizzo di </w:t>
+      </w:r>
+      <w:proofErr w:type="spellStart"/>
+      <w:r>
+        <w:t>Vaadin</w:t>
+      </w:r>
+      <w:proofErr w:type="spellEnd"/>
+      <w:r>
+        <w:t xml:space="preserve"> e </w:t>
+      </w:r>
+      <w:proofErr w:type="spellStart"/>
+      <w:r>
+        <w:t>SpringBoot</w:t>
+      </w:r>
+      <w:proofErr w:type="spellEnd"/>
+      <w:r>
+        <w:t xml:space="preserve"> e creazione classe Application per il funzionamento del programma.</w:t>
+      </w:r>
+    </w:p>
+    <w:p>
+      <w:pPr>
+        <w:spacing w:after="0"/>
+      </w:pPr>
+    </w:p>
+    <w:p>
+      <w:pPr>
+        <w:spacing w:after="0"/>
+      </w:pPr>
+    </w:p>
+    <w:p>
+      <w:pPr>
+        <w:spacing w:after="0"/>
         <w:rPr>
           <w:b/>
           <w:bCs/>
@@ -658,28 +821,50 @@
       </w:r>
     </w:p>
     <w:p>
+      <w:pPr>
+        <w:spacing w:after="0"/>
+      </w:pPr>
       <w:r>
         <w:t xml:space="preserve">Analisi delle modifiche effettuate nella settimana precedente, discussione riguardo problemi e obiettivi raggiunti. </w:t>
       </w:r>
     </w:p>
     <w:p>
+      <w:pPr>
+        <w:spacing w:after="0"/>
+      </w:pPr>
       <w:r>
         <w:t>Nessun problema importante è stato rilevato, il software funziona in maniera corretta ma parziale.</w:t>
       </w:r>
     </w:p>
     <w:p>
+      <w:pPr>
+        <w:spacing w:after="0"/>
+      </w:pPr>
       <w:r>
         <w:t>Decisione di aggiungere un documento a parte per descrivere in maniera più esplicita la specifica dei requisiti con nome, descrizione e data in cui è stato raggiunto.</w:t>
       </w:r>
     </w:p>
     <w:p>
+      <w:pPr>
+        <w:spacing w:after="0"/>
+      </w:pPr>
       <w:r>
         <w:t>Nella prossima settimana il team punta ad aggiungere le funzionalità essenziali rimanenti, quali la gestione delle prenotazioni e tutte le pagine che al momento sono vuote.</w:t>
       </w:r>
     </w:p>
-    <w:p/>
-    <w:p>
-      <w:pPr>
+    <w:p>
+      <w:pPr>
+        <w:spacing w:after="0"/>
+      </w:pPr>
+    </w:p>
+    <w:p>
+      <w:pPr>
+        <w:spacing w:after="0"/>
+      </w:pPr>
+    </w:p>
+    <w:p>
+      <w:pPr>
+        <w:spacing w:after="0"/>
         <w:rPr>
           <w:b/>
           <w:bCs/>
@@ -700,15 +885,7 @@
           <w:bCs/>
           <w:u w:val="single"/>
         </w:rPr>
-        <w:t>1</w:t>
-      </w:r>
-      <w:r>
-        <w:rPr>
-          <w:b/>
-          <w:bCs/>
-          <w:u w:val="single"/>
-        </w:rPr>
-        <w:t>8</w:t>
+        <w:t>18</w:t>
       </w:r>
       <w:r>
         <w:rPr>
@@ -744,6 +921,9 @@
       </w:r>
     </w:p>
     <w:p>
+      <w:pPr>
+        <w:spacing w:after="0"/>
+      </w:pPr>
       <w:r>
         <w:t xml:space="preserve">Durante uno spassoso pranzo il gruppo ha discusso riguardo le modifiche avvenute in seguito al meeting precedente. Sono stati raggiunti gli obiettivi essenziali per far funzionare l’applicazione in maniera corretta. Il software è </w:t>
       </w:r>
@@ -755,28 +935,165 @@
       </w:r>
     </w:p>
     <w:p>
-      <w:r>
-        <w:t>Sono state aggiunte su github alcune issue riguardanti gli aspetti da sistemare o le funzioni da aggiungere nelle prossime settimane</w:t>
+      <w:pPr>
+        <w:spacing w:after="0"/>
+      </w:pPr>
+      <w:r>
+        <w:t xml:space="preserve">Sono state aggiunte su </w:t>
+      </w:r>
+      <w:proofErr w:type="spellStart"/>
+      <w:r>
+        <w:t>github</w:t>
+      </w:r>
+      <w:proofErr w:type="spellEnd"/>
+      <w:r>
+        <w:t xml:space="preserve"> alcune </w:t>
+      </w:r>
+      <w:proofErr w:type="spellStart"/>
+      <w:r>
+        <w:t>issue</w:t>
+      </w:r>
+      <w:proofErr w:type="spellEnd"/>
+      <w:r>
+        <w:t xml:space="preserve"> riguardanti gli aspetti da sistemare o le funzioni da aggiungere nelle prossime settimane</w:t>
       </w:r>
       <w:r>
         <w:t>.</w:t>
       </w:r>
     </w:p>
     <w:p>
+      <w:pPr>
+        <w:spacing w:after="0"/>
+      </w:pPr>
       <w:r>
         <w:t>Sono state inoltre discusse funzionalità extra quali vedere la carica dell’auto e la gestione dei dati e delle statistiche per l’admin.</w:t>
       </w:r>
     </w:p>
     <w:p>
+      <w:pPr>
+        <w:spacing w:after="0"/>
+      </w:pPr>
       <w:r>
         <w:t>Riguardo i diagrammi è stato concluso il diagramma di sequenza.</w:t>
       </w:r>
     </w:p>
     <w:p>
-      <w:r>
-        <w:t>Per il prossimo meeting ci si aspetta che una parte delle issue vengano risolte e che si sistemino i problemi relativi alla sicurezza e all’accesso alle pagine oltre a bug grafici/logici anch’essi da sistemare.</w:t>
-      </w:r>
-    </w:p>
+      <w:pPr>
+        <w:spacing w:after="0"/>
+      </w:pPr>
+      <w:r>
+        <w:t xml:space="preserve">Per il prossimo meeting ci si aspetta che una parte delle </w:t>
+      </w:r>
+      <w:proofErr w:type="spellStart"/>
+      <w:r>
+        <w:t>issue</w:t>
+      </w:r>
+      <w:proofErr w:type="spellEnd"/>
+      <w:r>
+        <w:t xml:space="preserve"> vengano risolte e che si sistemino i problemi relativi alla sicurezza e all’accesso alle pagine oltre a bug grafici/logici anch’essi da sistemare.</w:t>
+      </w:r>
+    </w:p>
+    <w:p>
+      <w:pPr>
+        <w:spacing w:after="0"/>
+      </w:pPr>
+    </w:p>
+    <w:p>
+      <w:pPr>
+        <w:spacing w:after="0"/>
+      </w:pPr>
+    </w:p>
+    <w:p>
+      <w:pPr>
+        <w:spacing w:after="0"/>
+        <w:rPr>
+          <w:b/>
+          <w:bCs/>
+          <w:u w:val="single"/>
+        </w:rPr>
+      </w:pPr>
+      <w:r>
+        <w:rPr>
+          <w:b/>
+          <w:bCs/>
+          <w:u w:val="single"/>
+        </w:rPr>
+        <w:t xml:space="preserve">Meeting </w:t>
+      </w:r>
+      <w:r>
+        <w:rPr>
+          <w:b/>
+          <w:bCs/>
+          <w:u w:val="single"/>
+        </w:rPr>
+        <w:t>24/11/2025</w:t>
+      </w:r>
+    </w:p>
+    <w:p>
+      <w:pPr>
+        <w:spacing w:after="0"/>
+      </w:pPr>
+      <w:r>
+        <w:t xml:space="preserve">Una buona parte delle </w:t>
+      </w:r>
+      <w:proofErr w:type="spellStart"/>
+      <w:r>
+        <w:t>issue</w:t>
+      </w:r>
+      <w:proofErr w:type="spellEnd"/>
+      <w:r>
+        <w:t xml:space="preserve"> sono state risolte. Altre secondarie sono state aggiunte.</w:t>
+      </w:r>
+    </w:p>
+    <w:p>
+      <w:pPr>
+        <w:spacing w:after="0"/>
+      </w:pPr>
+      <w:r>
+        <w:t>Sono state completate alcune funzioni che nei meeting precedenti erano parzialmente funzionanti e si è  deciso di implementare la funzionalità di visualizzare auto e carica (il team ha già aggiunto alcuni elementi fondamentali).</w:t>
+      </w:r>
+    </w:p>
+    <w:p>
+      <w:pPr>
+        <w:spacing w:after="0"/>
+      </w:pPr>
+      <w:r>
+        <w:t xml:space="preserve">Sono state fatte discussioni riguardo la parte di gestione dati nel </w:t>
+      </w:r>
+      <w:proofErr w:type="spellStart"/>
+      <w:r>
+        <w:t>db</w:t>
+      </w:r>
+      <w:proofErr w:type="spellEnd"/>
+      <w:r>
+        <w:t>, in particolare sulle prenotazioni, con la decisione di inserire anche l’auto al suo interno.</w:t>
+      </w:r>
+    </w:p>
+    <w:p>
+      <w:pPr>
+        <w:spacing w:after="0"/>
+      </w:pPr>
+      <w:r>
+        <w:t>Si sta costruendo il diagramma di comunicazione.</w:t>
+      </w:r>
+    </w:p>
+    <w:p>
+      <w:pPr>
+        <w:spacing w:after="0"/>
+      </w:pPr>
+      <w:r>
+        <w:t xml:space="preserve">Nel prossimo meeting ci si aspetta conclusa la funzionalità della gestione delle auto e della ricarica e la risoluzione delle </w:t>
+      </w:r>
+      <w:proofErr w:type="spellStart"/>
+      <w:r>
+        <w:t>issue</w:t>
+      </w:r>
+      <w:proofErr w:type="spellEnd"/>
+      <w:r>
+        <w:t xml:space="preserve"> rimanenti.</w:t>
+      </w:r>
+    </w:p>
+    <w:p/>
     <w:p/>
     <w:p/>
     <w:p/>
@@ -2271,7 +2588,7 @@
   <w:style w:type="paragraph" w:default="1" w:styleId="Normale">
     <w:name w:val="Normal"/>
     <w:qFormat/>
-    <w:rsid w:val="008B4AEA"/>
+    <w:rsid w:val="006F35C3"/>
   </w:style>
   <w:style w:type="paragraph" w:styleId="Titolo1">
     <w:name w:val="heading 1"/>

</xml_diff>